<commit_message>
Joues de raie en gratin, trois nouvelles recettes, générateur du livre
« Gratin de raie » renommé « Joues de raie en gratin » (correction de
l'auteur, ancienne adresse redirigée). Ajout du poulet au champagne et
au chaource, des farfalles au jambon cru et du ragoût limousin, en
français, anglais et italien. Le livre (PDF, Word, fichiers par recette)
est regénéré par outils/livre.py à partir des données du site.
</commit_message>
<xml_diff>
--- a/livre/Recettes (une par fichier)/1 - Bases/Pâte brisée au beurre.docx
+++ b/livre/Recettes (une par fichier)/1 - Bases/Pâte brisée au beurre.docx
@@ -820,12 +820,11 @@
       <w:contextualSpacing/>
     </w:pPr>
     <w:rPr>
-      <w:rFonts w:ascii="Georgia" w:hAnsi="Georgia" w:eastAsia="Georgia" w:cs="Georgia"/>
-      <w:b/>
-      <w:color w:val="8C3B1E"/>
+      <w:rFonts w:asciiTheme="majorHAnsi" w:eastAsiaTheme="majorEastAsia" w:hAnsiTheme="majorHAnsi" w:cstheme="majorBidi"/>
+      <w:color w:val="17365D" w:themeColor="text2" w:themeShade="BF"/>
       <w:spacing w:val="5"/>
       <w:kern w:val="28"/>
-      <w:sz w:val="68"/>
+      <w:sz w:val="52"/>
       <w:szCs w:val="52"/>
     </w:rPr>
   </w:style>

</xml_diff>

<commit_message>
Photos d'illustration pour les maquereaux marinés et le ragoût limousin
Photos libres de Wikimedia Commons avec mention de l'auteur et de la
licence, sur le site et désormais aussi dans le livre (PDF, Word et
fichiers par recette).
</commit_message>
<xml_diff>
--- a/livre/Recettes (une par fichier)/1 - Bases/Pâte brisée au beurre.docx
+++ b/livre/Recettes (une par fichier)/1 - Bases/Pâte brisée au beurre.docx
@@ -8,6 +8,52 @@
       </w:pPr>
       <w:r>
         <w:t>Pâte brisée au beurre</w:t>
+      </w:r>
+    </w:p>
+    <w:p>
+      <w:r>
+        <w:drawing>
+          <wp:inline xmlns:a="http://schemas.openxmlformats.org/drawingml/2006/main" xmlns:pic="http://schemas.openxmlformats.org/drawingml/2006/picture">
+            <wp:extent cx="4079999" cy="3059999"/>
+            <wp:docPr id="1" name="Picture 1"/>
+            <wp:cNvGraphicFramePr>
+              <a:graphicFrameLocks noChangeAspect="1"/>
+            </wp:cNvGraphicFramePr>
+            <a:graphic>
+              <a:graphicData uri="http://schemas.openxmlformats.org/drawingml/2006/picture">
+                <pic:pic>
+                  <pic:nvPicPr>
+                    <pic:cNvPr id="0" name="pate-brisee-au-beurre-illustration.jpg"/>
+                    <pic:cNvPicPr/>
+                  </pic:nvPicPr>
+                  <pic:blipFill>
+                    <a:blip r:embed="rId9"/>
+                    <a:stretch>
+                      <a:fillRect/>
+                    </a:stretch>
+                  </pic:blipFill>
+                  <pic:spPr>
+                    <a:xfrm>
+                      <a:off x="0" y="0"/>
+                      <a:ext cx="4079999" cy="3059999"/>
+                    </a:xfrm>
+                    <a:prstGeom prst="rect"/>
+                  </pic:spPr>
+                </pic:pic>
+              </a:graphicData>
+            </a:graphic>
+          </wp:inline>
+        </w:drawing>
+      </w:r>
+    </w:p>
+    <w:p>
+      <w:r>
+        <w:rPr>
+          <w:i/>
+          <w:color w:val="6B6158"/>
+          <w:sz w:val="16"/>
+        </w:rPr>
+        <w:t>Photo d’illustration : Romain Behar, Public domain, via Wikimedia Commons (https://commons.wikimedia.org/wiki/File:Recette_pate_brisee_etape_5.jpg)</w:t>
       </w:r>
     </w:p>
     <w:p>

</xml_diff>